<commit_message>
feat: apply logo 08D and Inteligência para decisão across brand guide
</commit_message>
<xml_diff>
--- a/Template_A4_NeuralMind_AI.docx
+++ b/Template_A4_NeuralMind_AI.docx
@@ -44,7 +44,7 @@
             <w:r>
               <w:drawing>
                 <wp:inline xmlns:a="http://schemas.openxmlformats.org/drawingml/2006/main" xmlns:pic="http://schemas.openxmlformats.org/drawingml/2006/picture">
-                  <wp:extent cx="2148840" cy="304808"/>
+                  <wp:extent cx="2148840" cy="202792"/>
                   <wp:docPr id="1" name="Picture 1" descr="Logotipo NeuralMind.AI" title="Logotipo NeuralMind.AI"/>
                   <wp:cNvGraphicFramePr>
                     <a:graphicFrameLocks noChangeAspect="1"/>
@@ -65,7 +65,7 @@
                         <pic:spPr>
                           <a:xfrm>
                             <a:off x="0" y="0"/>
-                            <a:ext cx="2148840" cy="304808"/>
+                            <a:ext cx="2148840" cy="202792"/>
                           </a:xfrm>
                           <a:prstGeom prst="rect"/>
                         </pic:spPr>
@@ -194,7 +194,7 @@
                 <w:color w:val="FFFFFC"/>
                 <w:sz w:val="19"/>
               </w:rPr>
-              <w:t>IA responsável para setores críticos</w:t>
+              <w:t>Inteligência para decisão</w:t>
             </w:r>
           </w:p>
         </w:tc>
@@ -203,6 +203,7 @@
     <w:p>
       <w:pPr>
         <w:sectPr>
+          <w:headerReference w:type="default" r:id="rId12"/>
           <w:pgSz w:w="11906" w:h="16838"/>
           <w:pgMar w:top="255" w:right="255" w:bottom="255" w:left="255" w:header="0" w:footer="0" w:gutter="0"/>
           <w:cols w:space="720"/>
@@ -1054,23 +1055,49 @@
       </w:pBdr>
     </w:pPr>
     <w:r>
-      <w:rPr>
-        <w:rFonts w:ascii="Arial" w:hAnsi="Arial" w:eastAsia="Arial"/>
-        <w:b/>
-        <w:color w:val="290241"/>
-        <w:sz w:val="31"/>
-      </w:rPr>
-      <w:t>NeuralMind</w:t>
+      <w:drawing>
+        <wp:inline xmlns:a="http://schemas.openxmlformats.org/drawingml/2006/main" xmlns:pic="http://schemas.openxmlformats.org/drawingml/2006/picture">
+          <wp:extent cx="1645920" cy="155330"/>
+          <wp:docPr id="1" name="Picture 1"/>
+          <wp:cNvGraphicFramePr>
+            <a:graphicFrameLocks noChangeAspect="1"/>
+          </wp:cNvGraphicFramePr>
+          <a:graphic>
+            <a:graphicData uri="http://schemas.openxmlformats.org/drawingml/2006/picture">
+              <pic:pic>
+                <pic:nvPicPr>
+                  <pic:cNvPr id="0" name="neuralmind-ai-purple.png"/>
+                  <pic:cNvPicPr/>
+                </pic:nvPicPr>
+                <pic:blipFill>
+                  <a:blip r:embed="rId1"/>
+                  <a:stretch>
+                    <a:fillRect/>
+                  </a:stretch>
+                </pic:blipFill>
+                <pic:spPr>
+                  <a:xfrm>
+                    <a:off x="0" y="0"/>
+                    <a:ext cx="1645920" cy="155330"/>
+                  </a:xfrm>
+                  <a:prstGeom prst="rect"/>
+                </pic:spPr>
+              </pic:pic>
+            </a:graphicData>
+          </a:graphic>
+        </wp:inline>
+      </w:drawing>
     </w:r>
-    <w:r>
-      <w:rPr>
-        <w:rFonts w:ascii="Arial" w:hAnsi="Arial" w:eastAsia="Arial"/>
-        <w:b/>
-        <w:color w:val="9381FF"/>
-        <w:sz w:val="31"/>
-      </w:rPr>
-      <w:t>.AI</w:t>
-    </w:r>
+  </w:p>
+</w:hdr>
+</file>
+
+<file path=word/header2.xml><?xml version="1.0" encoding="utf-8"?>
+<w:hdr xmlns:m="http://schemas.openxmlformats.org/officeDocument/2006/math" xmlns:mc="http://schemas.openxmlformats.org/markup-compatibility/2006" xmlns:mo="http://schemas.microsoft.com/office/mac/office/2008/main" xmlns:mv="urn:schemas-microsoft-com:mac:vml" xmlns:o="urn:schemas-microsoft-com:office:office" xmlns:r="http://schemas.openxmlformats.org/officeDocument/2006/relationships" xmlns:v="urn:schemas-microsoft-com:vml" xmlns:w10="urn:schemas-microsoft-com:office:word" xmlns:w14="http://schemas.microsoft.com/office/word/2010/wordml" xmlns:w="http://schemas.openxmlformats.org/wordprocessingml/2006/main" xmlns:wne="http://schemas.microsoft.com/office/word/2006/wordml" xmlns:wp14="http://schemas.microsoft.com/office/word/2010/wordprocessingDrawing" xmlns:wp="http://schemas.openxmlformats.org/drawingml/2006/wordprocessingDrawing" xmlns:wpc="http://schemas.microsoft.com/office/word/2010/wordprocessingCanvas" xmlns:wpg="http://schemas.microsoft.com/office/word/2010/wordprocessingGroup" xmlns:wpi="http://schemas.microsoft.com/office/word/2010/wordprocessingInk" xmlns:wps="http://schemas.microsoft.com/office/word/2010/wordprocessingShape" mc:Ignorable="w14 wp14">
+  <w:p>
+    <w:pPr>
+      <w:pStyle w:val="Header"/>
+    </w:pPr>
   </w:p>
 </w:hdr>
 </file>

</xml_diff>

<commit_message>
Adopt Outfit A2 identity across brand guide and media
</commit_message>
<xml_diff>
--- a/Template_A4_NeuralMind_AI.docx
+++ b/Template_A4_NeuralMind_AI.docx
@@ -18,34 +18,35 @@
         </w:tblBorders>
       </w:tblPr>
       <w:tblGrid>
-        <w:gridCol w:w="11395"/>
+        <w:gridCol w:w="11906"/>
       </w:tblGrid>
       <w:tr>
         <w:trPr>
-          <w:trHeight w:val="16129" w:hRule="exact"/>
+          <w:trHeight w:val="16826" w:hRule="exact"/>
           <w:tblHeader w:val="true"/>
         </w:trPr>
         <w:tc>
           <w:tcPr>
-            <w:tcW w:type="dxa" w:w="11395"/>
+            <w:tcW w:type="dxa" w:w="11906"/>
             <w:vAlign w:val="top"/>
             <w:shd w:fill="290241" w:val="clear"/>
             <w:tcMar>
-              <w:top w:w="820" w:type="dxa"/>
-              <w:start w:w="1190" w:type="dxa"/>
-              <w:bottom w:w="620" w:type="dxa"/>
-              <w:end w:w="1190" w:type="dxa"/>
+              <w:top w:w="900" w:type="dxa"/>
+              <w:start w:w="1815" w:type="dxa"/>
+              <w:bottom w:w="800" w:type="dxa"/>
+              <w:end w:w="1815" w:type="dxa"/>
             </w:tcMar>
           </w:tcPr>
           <w:p>
             <w:pPr>
               <w:spacing w:after="2360"/>
+              <w:jc w:val="center"/>
             </w:pPr>
             <w:r>
               <w:drawing>
                 <wp:inline xmlns:a="http://schemas.openxmlformats.org/drawingml/2006/main" xmlns:pic="http://schemas.openxmlformats.org/drawingml/2006/picture">
-                  <wp:extent cx="2148840" cy="202792"/>
-                  <wp:docPr id="1" name="Picture 1" descr="Logotipo NeuralMind.AI" title="Logotipo NeuralMind.AI"/>
+                  <wp:extent cx="2148840" cy="461597"/>
+                  <wp:docPr id="1" name="Picture 1" descr="Logotipo NeuralMind.ai" title="Logotipo NeuralMind.ai"/>
                   <wp:cNvGraphicFramePr>
                     <a:graphicFrameLocks noChangeAspect="1"/>
                   </wp:cNvGraphicFramePr>
@@ -65,7 +66,7 @@
                         <pic:spPr>
                           <a:xfrm>
                             <a:off x="0" y="0"/>
-                            <a:ext cx="2148840" cy="202792"/>
+                            <a:ext cx="2148840" cy="461597"/>
                           </a:xfrm>
                           <a:prstGeom prst="rect"/>
                         </pic:spPr>
@@ -83,7 +84,7 @@
             </w:pPr>
             <w:r>
               <w:rPr>
-                <w:rFonts w:ascii="Arial" w:hAnsi="Arial" w:eastAsia="Arial"/>
+                <w:rFonts w:ascii="Outfit" w:hAnsi="Outfit" w:eastAsia="Outfit"/>
                 <w:b/>
                 <w:color w:val="9381FF"/>
               </w:rPr>
@@ -96,7 +97,7 @@
             </w:pPr>
             <w:r>
               <w:rPr>
-                <w:rFonts w:ascii="Arial" w:hAnsi="Arial" w:eastAsia="Arial"/>
+                <w:rFonts w:ascii="Outfit" w:hAnsi="Outfit" w:eastAsia="Outfit"/>
                 <w:b/>
                 <w:color w:val="FFFFFC"/>
                 <w:sz w:val="56"/>
@@ -107,13 +108,10 @@
           <w:p>
             <w:pPr>
               <w:pStyle w:val="Subtitle"/>
-              <w:pBdr>
-                <w:bottom w:val="single" w:sz="10" w:space="12" w:color="EF476F"/>
-              </w:pBdr>
             </w:pPr>
             <w:r>
               <w:rPr>
-                <w:rFonts w:ascii="Arial" w:hAnsi="Arial" w:eastAsia="Arial"/>
+                <w:rFonts w:ascii="Outfit" w:hAnsi="Outfit" w:eastAsia="Outfit"/>
                 <w:color w:val="FFFFFC"/>
                 <w:sz w:val="25"/>
               </w:rPr>
@@ -122,7 +120,7 @@
           </w:p>
           <w:p>
             <w:pPr>
-              <w:spacing w:after="2240"/>
+              <w:spacing w:after="2520"/>
             </w:pPr>
             <w:r/>
           </w:p>
@@ -133,7 +131,7 @@
             </w:pPr>
             <w:r>
               <w:rPr>
-                <w:rFonts w:ascii="Arial" w:hAnsi="Arial" w:eastAsia="Arial"/>
+                <w:rFonts w:ascii="Outfit" w:hAnsi="Outfit" w:eastAsia="Outfit"/>
                 <w:b/>
                 <w:color w:val="9381FF"/>
               </w:rPr>
@@ -146,7 +144,7 @@
             </w:pPr>
             <w:r>
               <w:rPr>
-                <w:rFonts w:ascii="Arial" w:hAnsi="Arial" w:eastAsia="Arial"/>
+                <w:rFonts w:ascii="Outfit" w:hAnsi="Outfit" w:eastAsia="Outfit"/>
                 <w:color w:val="FFFFFC"/>
                 <w:sz w:val="21"/>
               </w:rPr>
@@ -160,7 +158,7 @@
             </w:pPr>
             <w:r>
               <w:rPr>
-                <w:rFonts w:ascii="Arial" w:hAnsi="Arial" w:eastAsia="Arial"/>
+                <w:rFonts w:ascii="Outfit" w:hAnsi="Outfit" w:eastAsia="Outfit"/>
                 <w:b/>
                 <w:color w:val="9381FF"/>
               </w:rPr>
@@ -169,32 +167,15 @@
           </w:p>
           <w:p>
             <w:pPr>
-              <w:spacing w:after="360"/>
+              <w:spacing w:after="0"/>
             </w:pPr>
             <w:r>
               <w:rPr>
-                <w:rFonts w:ascii="Arial" w:hAnsi="Arial" w:eastAsia="Arial"/>
+                <w:rFonts w:ascii="Outfit" w:hAnsi="Outfit" w:eastAsia="Outfit"/>
                 <w:color w:val="FFFFFC"/>
                 <w:sz w:val="21"/>
               </w:rPr>
               <w:t>[dd.mm.aaaa]  /  [v1.0]</w:t>
-            </w:r>
-          </w:p>
-          <w:p>
-            <w:pPr>
-              <w:spacing w:before="80" w:after="0"/>
-              <w:pBdr>
-                <w:top w:val="single" w:sz="6" w:space="8" w:color="9381FF"/>
-              </w:pBdr>
-            </w:pPr>
-            <w:r>
-              <w:rPr>
-                <w:rFonts w:ascii="Arial" w:hAnsi="Arial" w:eastAsia="Arial"/>
-                <w:b/>
-                <w:color w:val="FFFFFC"/>
-                <w:sz w:val="19"/>
-              </w:rPr>
-              <w:t>Inteligência para decisão</w:t>
             </w:r>
           </w:p>
         </w:tc>
@@ -203,9 +184,8 @@
     <w:p>
       <w:pPr>
         <w:sectPr>
-          <w:headerReference w:type="default" r:id="rId12"/>
           <w:pgSz w:w="11906" w:h="16838"/>
-          <w:pgMar w:top="255" w:right="255" w:bottom="255" w:left="255" w:header="0" w:footer="0" w:gutter="0"/>
+          <w:pgMar w:top="0" w:right="0" w:bottom="0" w:left="0" w:header="0" w:footer="0" w:gutter="0"/>
           <w:cols w:space="720"/>
           <w:docGrid w:linePitch="360"/>
         </w:sectPr>
@@ -218,7 +198,7 @@
       </w:pPr>
       <w:r>
         <w:rPr>
-          <w:rFonts w:ascii="Arial" w:hAnsi="Arial" w:eastAsia="Arial"/>
+          <w:rFonts w:ascii="Outfit" w:hAnsi="Outfit" w:eastAsia="Outfit"/>
           <w:i/>
           <w:color w:val="5C5861"/>
           <w:sz w:val="17"/>
@@ -245,13 +225,11 @@
     <w:p>
       <w:pPr>
         <w:pStyle w:val="NMCallout"/>
-        <w:pBdr>
-          <w:top w:val="single" w:sz="8" w:space="8" w:color="9381FF"/>
-        </w:pBdr>
+        <w:spacing w:before="160" w:after="360"/>
       </w:pPr>
       <w:r>
         <w:rPr>
-          <w:rFonts w:ascii="Arial" w:hAnsi="Arial" w:eastAsia="Arial"/>
+          <w:rFonts w:ascii="Outfit" w:hAnsi="Outfit" w:eastAsia="Outfit"/>
           <w:b/>
           <w:color w:val="9381FF"/>
           <w:sz w:val="16"/>
@@ -261,7 +239,7 @@
       </w:r>
       <w:r>
         <w:rPr>
-          <w:rFonts w:ascii="Arial" w:hAnsi="Arial" w:eastAsia="Arial"/>
+          <w:rFonts w:ascii="Outfit" w:hAnsi="Outfit" w:eastAsia="Outfit"/>
           <w:color w:val="290241"/>
           <w:sz w:val="22"/>
         </w:rPr>
@@ -282,7 +260,7 @@
       </w:pPr>
       <w:r>
         <w:rPr>
-          <w:rFonts w:ascii="Arial" w:hAnsi="Arial" w:eastAsia="Arial"/>
+          <w:rFonts w:ascii="Outfit" w:hAnsi="Outfit" w:eastAsia="Outfit"/>
           <w:color w:val="0F1108"/>
         </w:rPr>
         <w:t>[Explique o cenário com fatos, referências e vocabulário técnico preciso. Dê ao leitor apenas o contexto necessário para compreender a análise.]</w:t>
@@ -294,7 +272,7 @@
       </w:pPr>
       <w:r>
         <w:rPr>
-          <w:rFonts w:ascii="Arial" w:hAnsi="Arial" w:eastAsia="Arial"/>
+          <w:rFonts w:ascii="Outfit" w:hAnsi="Outfit" w:eastAsia="Outfit"/>
           <w:color w:val="0F1108"/>
         </w:rPr>
         <w:t>[Conecte o problema às pessoas, aos processos e às decisões envolvidas. Prefira frases naturais e concretas a fórmulas institucionais genéricas.]</w:t>
@@ -334,44 +312,6 @@
     </w:p>
     <w:p>
       <w:pPr>
-        <w:pStyle w:val="Heading2"/>
-      </w:pPr>
-      <w:r>
-        <w:t>Princípio orientador</w:t>
-      </w:r>
-    </w:p>
-    <w:p>
-      <w:pPr>
-        <w:pStyle w:val="NMQuote"/>
-        <w:pBdr>
-          <w:top w:val="single" w:sz="8" w:space="8" w:color="EF476F"/>
-        </w:pBdr>
-      </w:pPr>
-      <w:r>
-        <w:rPr>
-          <w:rFonts w:ascii="Arial" w:hAnsi="Arial" w:eastAsia="Arial"/>
-          <w:i/>
-          <w:color w:val="290241"/>
-          <w:sz w:val="27"/>
-        </w:rPr>
-        <w:t>“[Uma frase humana, específica e memorável que sustenta o raciocínio.]”</w:t>
-      </w:r>
-    </w:p>
-    <w:p>
-      <w:pPr>
-        <w:pStyle w:val="NMCaption"/>
-      </w:pPr>
-      <w:r>
-        <w:t>[Autoria, fonte ou contexto]</w:t>
-      </w:r>
-    </w:p>
-    <w:p>
-      <w:r>
-        <w:br w:type="page"/>
-      </w:r>
-    </w:p>
-    <w:p>
-      <w:pPr>
         <w:pStyle w:val="Heading1"/>
       </w:pPr>
       <w:r>
@@ -384,7 +324,7 @@
       </w:pPr>
       <w:r>
         <w:rPr>
-          <w:rFonts w:ascii="Arial" w:hAnsi="Arial" w:eastAsia="Arial"/>
+          <w:rFonts w:ascii="Outfit" w:hAnsi="Outfit" w:eastAsia="Outfit"/>
           <w:color w:val="0F1108"/>
         </w:rPr>
         <w:t>[Descreva a execução como uma sequência real. Cada etapa deve indicar uma ação, seu responsável e o resultado esperado.]</w:t>
@@ -416,6 +356,18 @@
     </w:p>
     <w:p>
       <w:pPr>
+        <w:sectPr>
+          <w:headerReference w:type="default" r:id="rId10"/>
+          <w:footerReference w:type="default" r:id="rId11"/>
+          <w:pgSz w:w="11906" w:h="16838"/>
+          <w:pgMar w:top="1219" w:right="1191" w:bottom="1134" w:left="1191" w:header="482" w:footer="510" w:gutter="0"/>
+          <w:cols w:space="720"/>
+          <w:docGrid w:linePitch="360"/>
+        </w:sectPr>
+      </w:pPr>
+    </w:p>
+    <w:p>
+      <w:pPr>
         <w:pStyle w:val="Heading2"/>
       </w:pPr>
       <w:r>
@@ -474,7 +426,7 @@
             </w:pPr>
             <w:r>
               <w:rPr>
-                <w:rFonts w:ascii="Arial" w:hAnsi="Arial" w:eastAsia="Arial"/>
+                <w:rFonts w:ascii="Outfit" w:hAnsi="Outfit" w:eastAsia="Outfit"/>
                 <w:b/>
                 <w:color w:val="290241"/>
                 <w:sz w:val="17"/>
@@ -501,7 +453,7 @@
             </w:pPr>
             <w:r>
               <w:rPr>
-                <w:rFonts w:ascii="Arial" w:hAnsi="Arial" w:eastAsia="Arial"/>
+                <w:rFonts w:ascii="Outfit" w:hAnsi="Outfit" w:eastAsia="Outfit"/>
                 <w:b/>
                 <w:color w:val="290241"/>
                 <w:sz w:val="17"/>
@@ -528,7 +480,7 @@
             </w:pPr>
             <w:r>
               <w:rPr>
-                <w:rFonts w:ascii="Arial" w:hAnsi="Arial" w:eastAsia="Arial"/>
+                <w:rFonts w:ascii="Outfit" w:hAnsi="Outfit" w:eastAsia="Outfit"/>
                 <w:b/>
                 <w:color w:val="290241"/>
                 <w:sz w:val="17"/>
@@ -555,7 +507,7 @@
             </w:pPr>
             <w:r>
               <w:rPr>
-                <w:rFonts w:ascii="Arial" w:hAnsi="Arial" w:eastAsia="Arial"/>
+                <w:rFonts w:ascii="Outfit" w:hAnsi="Outfit" w:eastAsia="Outfit"/>
                 <w:b/>
                 <w:color w:val="290241"/>
                 <w:sz w:val="17"/>
@@ -583,7 +535,7 @@
             </w:pPr>
             <w:r>
               <w:rPr>
-                <w:rFonts w:ascii="Arial" w:hAnsi="Arial" w:eastAsia="Arial"/>
+                <w:rFonts w:ascii="Outfit" w:hAnsi="Outfit" w:eastAsia="Outfit"/>
                 <w:b/>
                 <w:color w:val="0F1108"/>
                 <w:sz w:val="18"/>
@@ -609,7 +561,7 @@
             </w:pPr>
             <w:r>
               <w:rPr>
-                <w:rFonts w:ascii="Arial" w:hAnsi="Arial" w:eastAsia="Arial"/>
+                <w:rFonts w:ascii="Outfit" w:hAnsi="Outfit" w:eastAsia="Outfit"/>
                 <w:b w:val="0"/>
                 <w:color w:val="0F1108"/>
                 <w:sz w:val="18"/>
@@ -636,7 +588,7 @@
             </w:pPr>
             <w:r>
               <w:rPr>
-                <w:rFonts w:ascii="Arial" w:hAnsi="Arial" w:eastAsia="Arial"/>
+                <w:rFonts w:ascii="Outfit" w:hAnsi="Outfit" w:eastAsia="Outfit"/>
                 <w:b w:val="0"/>
                 <w:color w:val="0F1108"/>
                 <w:sz w:val="18"/>
@@ -663,7 +615,7 @@
             </w:pPr>
             <w:r>
               <w:rPr>
-                <w:rFonts w:ascii="Arial" w:hAnsi="Arial" w:eastAsia="Arial"/>
+                <w:rFonts w:ascii="Outfit" w:hAnsi="Outfit" w:eastAsia="Outfit"/>
                 <w:b w:val="0"/>
                 <w:color w:val="0F1108"/>
                 <w:sz w:val="18"/>
@@ -692,7 +644,7 @@
             </w:pPr>
             <w:r>
               <w:rPr>
-                <w:rFonts w:ascii="Arial" w:hAnsi="Arial" w:eastAsia="Arial"/>
+                <w:rFonts w:ascii="Outfit" w:hAnsi="Outfit" w:eastAsia="Outfit"/>
                 <w:b/>
                 <w:color w:val="0F1108"/>
                 <w:sz w:val="18"/>
@@ -719,7 +671,7 @@
             </w:pPr>
             <w:r>
               <w:rPr>
-                <w:rFonts w:ascii="Arial" w:hAnsi="Arial" w:eastAsia="Arial"/>
+                <w:rFonts w:ascii="Outfit" w:hAnsi="Outfit" w:eastAsia="Outfit"/>
                 <w:b w:val="0"/>
                 <w:color w:val="0F1108"/>
                 <w:sz w:val="18"/>
@@ -747,7 +699,7 @@
             </w:pPr>
             <w:r>
               <w:rPr>
-                <w:rFonts w:ascii="Arial" w:hAnsi="Arial" w:eastAsia="Arial"/>
+                <w:rFonts w:ascii="Outfit" w:hAnsi="Outfit" w:eastAsia="Outfit"/>
                 <w:b w:val="0"/>
                 <w:color w:val="0F1108"/>
                 <w:sz w:val="18"/>
@@ -775,7 +727,7 @@
             </w:pPr>
             <w:r>
               <w:rPr>
-                <w:rFonts w:ascii="Arial" w:hAnsi="Arial" w:eastAsia="Arial"/>
+                <w:rFonts w:ascii="Outfit" w:hAnsi="Outfit" w:eastAsia="Outfit"/>
                 <w:b w:val="0"/>
                 <w:color w:val="0F1108"/>
                 <w:sz w:val="18"/>
@@ -803,7 +755,7 @@
             </w:pPr>
             <w:r>
               <w:rPr>
-                <w:rFonts w:ascii="Arial" w:hAnsi="Arial" w:eastAsia="Arial"/>
+                <w:rFonts w:ascii="Outfit" w:hAnsi="Outfit" w:eastAsia="Outfit"/>
                 <w:b/>
                 <w:color w:val="0F1108"/>
                 <w:sz w:val="18"/>
@@ -829,7 +781,7 @@
             </w:pPr>
             <w:r>
               <w:rPr>
-                <w:rFonts w:ascii="Arial" w:hAnsi="Arial" w:eastAsia="Arial"/>
+                <w:rFonts w:ascii="Outfit" w:hAnsi="Outfit" w:eastAsia="Outfit"/>
                 <w:b w:val="0"/>
                 <w:color w:val="0F1108"/>
                 <w:sz w:val="18"/>
@@ -856,7 +808,7 @@
             </w:pPr>
             <w:r>
               <w:rPr>
-                <w:rFonts w:ascii="Arial" w:hAnsi="Arial" w:eastAsia="Arial"/>
+                <w:rFonts w:ascii="Outfit" w:hAnsi="Outfit" w:eastAsia="Outfit"/>
                 <w:b w:val="0"/>
                 <w:color w:val="0F1108"/>
                 <w:sz w:val="18"/>
@@ -883,7 +835,7 @@
             </w:pPr>
             <w:r>
               <w:rPr>
-                <w:rFonts w:ascii="Arial" w:hAnsi="Arial" w:eastAsia="Arial"/>
+                <w:rFonts w:ascii="Outfit" w:hAnsi="Outfit" w:eastAsia="Outfit"/>
                 <w:b w:val="0"/>
                 <w:color w:val="0F1108"/>
                 <w:sz w:val="18"/>
@@ -904,9 +856,7 @@
     </w:p>
     <w:p>
       <w:pPr>
-        <w:pBdr>
-          <w:top w:val="single" w:sz="8" w:space="7" w:color="EF476F"/>
-        </w:pBdr>
+        <w:spacing w:before="80" w:after="320"/>
       </w:pPr>
       <w:r>
         <w:t>[Registre riscos, restrições, decisões pendentes ou requisitos de governança com linguagem direta.]</w:t>
@@ -926,7 +876,7 @@
       </w:pPr>
       <w:r>
         <w:rPr>
-          <w:rFonts w:ascii="Arial" w:hAnsi="Arial" w:eastAsia="Arial"/>
+          <w:rFonts w:ascii="Outfit" w:hAnsi="Outfit" w:eastAsia="Outfit"/>
           <w:color w:val="0F1108"/>
         </w:rPr>
         <w:t>[Retome a mensagem principal, explicite a decisão esperada e indique o próximo marco. Termine com uma frase direta e acionável.]</w:t>
@@ -964,26 +914,9 @@
         <w:t>[Próximo ponto de controle / data]</w:t>
       </w:r>
     </w:p>
-    <w:p>
-      <w:pPr>
-        <w:pStyle w:val="NMLead"/>
-        <w:pBdr>
-          <w:top w:val="single" w:sz="8" w:space="9" w:color="9381FF"/>
-        </w:pBdr>
-      </w:pPr>
-      <w:r>
-        <w:rPr>
-          <w:rFonts w:ascii="Arial" w:hAnsi="Arial" w:eastAsia="Arial"/>
-          <w:b/>
-          <w:color w:val="290241"/>
-          <w:sz w:val="24"/>
-        </w:rPr>
-        <w:t>Tecnologia que fortalece pessoas, processos e decisões.</w:t>
-      </w:r>
-    </w:p>
     <w:sectPr>
-      <w:headerReference w:type="default" r:id="rId10"/>
-      <w:footerReference w:type="default" r:id="rId11"/>
+      <w:headerReference w:type="default" r:id="rId12"/>
+      <w:footerReference w:type="default" r:id="rId13"/>
       <w:pgSz w:w="11906" w:h="16838"/>
       <w:pgMar w:top="1219" w:right="1191" w:bottom="1134" w:left="1191" w:header="482" w:footer="510" w:gutter="0"/>
       <w:cols w:space="720"/>
@@ -1001,26 +934,23 @@
       <w:tabs>
         <w:tab w:pos="9524" w:val="right"/>
       </w:tabs>
-      <w:spacing w:before="80"/>
+      <w:spacing w:before="160"/>
       <w:jc w:val="left"/>
-      <w:pBdr>
-        <w:top w:val="single" w:sz="10" w:space="5" w:color="EF476F"/>
-      </w:pBdr>
     </w:pPr>
     <w:r>
       <w:rPr>
-        <w:rFonts w:ascii="Arial" w:hAnsi="Arial" w:eastAsia="Arial"/>
+        <w:rFonts w:ascii="Outfit" w:hAnsi="Outfit" w:eastAsia="Outfit"/>
         <w:color w:val="5C5861"/>
         <w:sz w:val="17"/>
       </w:rPr>
-      <w:t>NeuralMind.AI  |  Documento institucional</w:t>
+      <w:t>NeuralMind.ai  |  Documento institucional</w:t>
     </w:r>
     <w:r>
       <w:tab/>
     </w:r>
     <w:r>
       <w:rPr>
-        <w:rFonts w:ascii="Arial" w:hAnsi="Arial" w:eastAsia="Arial"/>
+        <w:rFonts w:ascii="Outfit" w:hAnsi="Outfit" w:eastAsia="Outfit"/>
         <w:b/>
         <w:color w:val="290241"/>
         <w:sz w:val="17"/>
@@ -1029,7 +959,54 @@
     </w:r>
     <w:r>
       <w:rPr>
-        <w:rFonts w:ascii="Arial" w:hAnsi="Arial" w:eastAsia="Arial"/>
+        <w:rFonts w:ascii="Outfit" w:hAnsi="Outfit" w:eastAsia="Outfit"/>
+        <w:color w:val="5C5861"/>
+        <w:sz w:val="17"/>
+      </w:rPr>
+      <w:fldChar w:fldCharType="begin"/>
+      <w:instrText xml:space="preserve">PAGE</w:instrText>
+      <w:fldChar w:fldCharType="separate"/>
+      <w:t>1</w:t>
+      <w:fldChar w:fldCharType="end"/>
+    </w:r>
+  </w:p>
+</w:ftr>
+</file>
+
+<file path=word/footer2.xml><?xml version="1.0" encoding="utf-8"?>
+<w:ftr xmlns:m="http://schemas.openxmlformats.org/officeDocument/2006/math" xmlns:mc="http://schemas.openxmlformats.org/markup-compatibility/2006" xmlns:mo="http://schemas.microsoft.com/office/mac/office/2008/main" xmlns:mv="urn:schemas-microsoft-com:mac:vml" xmlns:o="urn:schemas-microsoft-com:office:office" xmlns:r="http://schemas.openxmlformats.org/officeDocument/2006/relationships" xmlns:v="urn:schemas-microsoft-com:vml" xmlns:w10="urn:schemas-microsoft-com:office:word" xmlns:w14="http://schemas.microsoft.com/office/word/2010/wordml" xmlns:w="http://schemas.openxmlformats.org/wordprocessingml/2006/main" xmlns:wne="http://schemas.microsoft.com/office/word/2006/wordml" xmlns:wp14="http://schemas.microsoft.com/office/word/2010/wordprocessingDrawing" xmlns:wp="http://schemas.openxmlformats.org/drawingml/2006/wordprocessingDrawing" xmlns:wpc="http://schemas.microsoft.com/office/word/2010/wordprocessingCanvas" xmlns:wpg="http://schemas.microsoft.com/office/word/2010/wordprocessingGroup" xmlns:wpi="http://schemas.microsoft.com/office/word/2010/wordprocessingInk" xmlns:wps="http://schemas.microsoft.com/office/word/2010/wordprocessingShape" mc:Ignorable="w14 wp14">
+  <w:p>
+    <w:pPr>
+      <w:pStyle w:val="Footer"/>
+      <w:tabs>
+        <w:tab w:pos="9524" w:val="right"/>
+      </w:tabs>
+      <w:spacing w:before="160"/>
+      <w:jc w:val="left"/>
+    </w:pPr>
+    <w:r>
+      <w:rPr>
+        <w:rFonts w:ascii="Outfit" w:hAnsi="Outfit" w:eastAsia="Outfit"/>
+        <w:color w:val="5C5861"/>
+        <w:sz w:val="17"/>
+      </w:rPr>
+      <w:t>NeuralMind.ai  |  Documento institucional</w:t>
+    </w:r>
+    <w:r>
+      <w:tab/>
+    </w:r>
+    <w:r>
+      <w:rPr>
+        <w:rFonts w:ascii="Outfit" w:hAnsi="Outfit" w:eastAsia="Outfit"/>
+        <w:b/>
+        <w:color w:val="290241"/>
+        <w:sz w:val="17"/>
+      </w:rPr>
+      <w:t xml:space="preserve">PÁGINA </w:t>
+    </w:r>
+    <w:r>
+      <w:rPr>
+        <w:rFonts w:ascii="Outfit" w:hAnsi="Outfit" w:eastAsia="Outfit"/>
         <w:color w:val="5C5861"/>
         <w:sz w:val="17"/>
       </w:rPr>
@@ -1048,16 +1025,13 @@
   <w:p>
     <w:pPr>
       <w:pStyle w:val="Header"/>
-      <w:spacing w:after="60"/>
+      <w:spacing w:after="160"/>
       <w:jc w:val="left"/>
-      <w:pBdr>
-        <w:bottom w:val="single" w:sz="6" w:space="5" w:color="D8D1DE"/>
-      </w:pBdr>
     </w:pPr>
     <w:r>
       <w:drawing>
         <wp:inline xmlns:a="http://schemas.openxmlformats.org/drawingml/2006/main" xmlns:pic="http://schemas.openxmlformats.org/drawingml/2006/picture">
-          <wp:extent cx="1645920" cy="155330"/>
+          <wp:extent cx="1645920" cy="353564"/>
           <wp:docPr id="1" name="Picture 1"/>
           <wp:cNvGraphicFramePr>
             <a:graphicFrameLocks noChangeAspect="1"/>
@@ -1078,7 +1052,7 @@
                 <pic:spPr>
                   <a:xfrm>
                     <a:off x="0" y="0"/>
-                    <a:ext cx="1645920" cy="155330"/>
+                    <a:ext cx="1645920" cy="353564"/>
                   </a:xfrm>
                   <a:prstGeom prst="rect"/>
                 </pic:spPr>
@@ -1097,7 +1071,43 @@
   <w:p>
     <w:pPr>
       <w:pStyle w:val="Header"/>
-    </w:pPr>
+      <w:spacing w:after="160"/>
+      <w:jc w:val="left"/>
+    </w:pPr>
+    <w:r>
+      <w:drawing>
+        <wp:inline xmlns:a="http://schemas.openxmlformats.org/drawingml/2006/main" xmlns:pic="http://schemas.openxmlformats.org/drawingml/2006/picture">
+          <wp:extent cx="1645920" cy="353564"/>
+          <wp:docPr id="1" name="Picture 1"/>
+          <wp:cNvGraphicFramePr>
+            <a:graphicFrameLocks noChangeAspect="1"/>
+          </wp:cNvGraphicFramePr>
+          <a:graphic>
+            <a:graphicData uri="http://schemas.openxmlformats.org/drawingml/2006/picture">
+              <pic:pic>
+                <pic:nvPicPr>
+                  <pic:cNvPr id="0" name="neuralmind-ai-purple.png"/>
+                  <pic:cNvPicPr/>
+                </pic:nvPicPr>
+                <pic:blipFill>
+                  <a:blip r:embed="rId1"/>
+                  <a:stretch>
+                    <a:fillRect/>
+                  </a:stretch>
+                </pic:blipFill>
+                <pic:spPr>
+                  <a:xfrm>
+                    <a:off x="0" y="0"/>
+                    <a:ext cx="1645920" cy="353564"/>
+                  </a:xfrm>
+                  <a:prstGeom prst="rect"/>
+                </pic:spPr>
+              </pic:pic>
+            </a:graphicData>
+          </a:graphic>
+        </wp:inline>
+      </w:drawing>
+    </w:r>
   </w:p>
 </w:hdr>
 </file>
@@ -1470,7 +1480,7 @@
       <w:spacing w:after="120" w:line="307" w:lineRule="auto"/>
     </w:pPr>
     <w:rPr>
-      <w:rFonts w:ascii="Arial" w:hAnsi="Arial" w:eastAsia="Arial" w:cs="Arial"/>
+      <w:rFonts w:ascii="Outfit" w:hAnsi="Outfit" w:eastAsia="Outfit" w:cs="Outfit"/>
       <w:b w:val="0"/>
       <w:i w:val="0"/>
       <w:color w:val="0F1108"/>
@@ -1537,7 +1547,7 @@
       <w:outlineLvl w:val="0"/>
     </w:pPr>
     <w:rPr>
-      <w:rFonts w:ascii="Arial" w:hAnsi="Arial" w:eastAsia="Arial" w:cs="Arial"/>
+      <w:rFonts w:ascii="Outfit" w:hAnsi="Outfit" w:eastAsia="Outfit" w:cs="Outfit"/>
       <w:b/>
       <w:bCs/>
       <w:i w:val="0"/>
@@ -1563,7 +1573,7 @@
       <w:outlineLvl w:val="1"/>
     </w:pPr>
     <w:rPr>
-      <w:rFonts w:ascii="Arial" w:hAnsi="Arial" w:eastAsia="Arial" w:cs="Arial"/>
+      <w:rFonts w:ascii="Outfit" w:hAnsi="Outfit" w:eastAsia="Outfit" w:cs="Outfit"/>
       <w:b/>
       <w:bCs/>
       <w:i w:val="0"/>
@@ -1589,7 +1599,7 @@
       <w:outlineLvl w:val="2"/>
     </w:pPr>
     <w:rPr>
-      <w:rFonts w:ascii="Arial" w:hAnsi="Arial" w:eastAsia="Arial" w:cs="Arial"/>
+      <w:rFonts w:ascii="Outfit" w:hAnsi="Outfit" w:eastAsia="Outfit" w:cs="Outfit"/>
       <w:b/>
       <w:bCs/>
       <w:i w:val="0"/>
@@ -1830,7 +1840,7 @@
       <w:contextualSpacing/>
     </w:pPr>
     <w:rPr>
-      <w:rFonts w:ascii="Arial" w:hAnsi="Arial" w:eastAsia="Arial" w:cs="Arial"/>
+      <w:rFonts w:ascii="Outfit" w:hAnsi="Outfit" w:eastAsia="Outfit" w:cs="Outfit"/>
       <w:b/>
       <w:i w:val="0"/>
       <w:color w:val="290241"/>
@@ -1870,7 +1880,7 @@
       <w:spacing w:after="320" w:line="300" w:lineRule="auto"/>
     </w:pPr>
     <w:rPr>
-      <w:rFonts w:ascii="Arial" w:hAnsi="Arial" w:eastAsia="Arial" w:cs="Arial"/>
+      <w:rFonts w:ascii="Outfit" w:hAnsi="Outfit" w:eastAsia="Outfit" w:cs="Outfit"/>
       <w:b w:val="0"/>
       <w:i w:val="0"/>
       <w:iCs/>
@@ -2017,7 +2027,7 @@
       <w:contextualSpacing/>
     </w:pPr>
     <w:rPr>
-      <w:rFonts w:ascii="Arial" w:hAnsi="Arial" w:eastAsia="Arial" w:cs="Arial"/>
+      <w:rFonts w:ascii="Outfit" w:hAnsi="Outfit" w:eastAsia="Outfit" w:cs="Outfit"/>
       <w:b w:val="0"/>
       <w:i w:val="0"/>
       <w:color w:val="0F1108"/>
@@ -2065,7 +2075,7 @@
       <w:contextualSpacing/>
     </w:pPr>
     <w:rPr>
-      <w:rFonts w:ascii="Arial" w:hAnsi="Arial" w:eastAsia="Arial" w:cs="Arial"/>
+      <w:rFonts w:ascii="Outfit" w:hAnsi="Outfit" w:eastAsia="Outfit" w:cs="Outfit"/>
       <w:b w:val="0"/>
       <w:i w:val="0"/>
       <w:color w:val="0F1108"/>
@@ -13193,7 +13203,7 @@
       <w:spacing w:after="120"/>
     </w:pPr>
     <w:rPr>
-      <w:rFonts w:ascii="Arial" w:hAnsi="Arial" w:eastAsia="Arial" w:cs="Arial"/>
+      <w:rFonts w:ascii="Outfit" w:hAnsi="Outfit" w:eastAsia="Outfit" w:cs="Outfit"/>
       <w:b/>
       <w:i w:val="0"/>
       <w:color w:val="9381FF"/>
@@ -13207,7 +13217,7 @@
       <w:spacing w:after="300" w:line="322" w:lineRule="auto"/>
     </w:pPr>
     <w:rPr>
-      <w:rFonts w:ascii="Arial" w:hAnsi="Arial" w:eastAsia="Arial" w:cs="Arial"/>
+      <w:rFonts w:ascii="Outfit" w:hAnsi="Outfit" w:eastAsia="Outfit" w:cs="Outfit"/>
       <w:b w:val="0"/>
       <w:i w:val="0"/>
       <w:color w:val="290241"/>
@@ -13221,7 +13231,7 @@
       <w:spacing w:before="160" w:after="240" w:line="312" w:lineRule="auto"/>
     </w:pPr>
     <w:rPr>
-      <w:rFonts w:ascii="Arial" w:hAnsi="Arial" w:eastAsia="Arial" w:cs="Arial"/>
+      <w:rFonts w:ascii="Outfit" w:hAnsi="Outfit" w:eastAsia="Outfit" w:cs="Outfit"/>
       <w:b w:val="0"/>
       <w:i w:val="0"/>
       <w:color w:val="290241"/>
@@ -13235,7 +13245,7 @@
       <w:spacing w:before="80" w:after="160"/>
     </w:pPr>
     <w:rPr>
-      <w:rFonts w:ascii="Arial" w:hAnsi="Arial" w:eastAsia="Arial" w:cs="Arial"/>
+      <w:rFonts w:ascii="Outfit" w:hAnsi="Outfit" w:eastAsia="Outfit" w:cs="Outfit"/>
       <w:b w:val="0"/>
       <w:i w:val="0"/>
       <w:color w:val="5C5861"/>
@@ -13250,7 +13260,7 @@
       <w:spacing w:before="200" w:after="200" w:line="300" w:lineRule="auto"/>
     </w:pPr>
     <w:rPr>
-      <w:rFonts w:ascii="Arial" w:hAnsi="Arial" w:eastAsia="Arial" w:cs="Arial"/>
+      <w:rFonts w:ascii="Outfit" w:hAnsi="Outfit" w:eastAsia="Outfit" w:cs="Outfit"/>
       <w:b w:val="0"/>
       <w:i w:val="0"/>
       <w:color w:val="290241"/>

</xml_diff>

<commit_message>
Refine enterprise design and define three product verticals
</commit_message>
<xml_diff>
--- a/Template_A4_NeuralMind_AI.docx
+++ b/Template_A4_NeuralMind_AI.docx
@@ -199,7 +199,7 @@
       <w:r>
         <w:rPr>
           <w:rFonts w:ascii="Outfit" w:hAnsi="Outfit" w:eastAsia="Outfit"/>
-          <w:i/>
+          <w:i w:val="0"/>
           <w:color w:val="5C5861"/>
           <w:sz w:val="17"/>
         </w:rPr>
@@ -1477,7 +1477,7 @@
     <w:rsid w:val="00FC693F"/>
     <w:pPr>
       <w:widowControl/>
-      <w:spacing w:after="120" w:line="307" w:lineRule="auto"/>
+      <w:spacing w:after="120" w:line="324" w:lineRule="auto"/>
     </w:pPr>
     <w:rPr>
       <w:rFonts w:ascii="Outfit" w:hAnsi="Outfit" w:eastAsia="Outfit" w:cs="Outfit"/>
@@ -1552,7 +1552,7 @@
       <w:bCs/>
       <w:i w:val="0"/>
       <w:color w:val="290241"/>
-      <w:sz w:val="35"/>
+      <w:sz w:val="32"/>
       <w:szCs w:val="28"/>
     </w:rPr>
   </w:style>

</xml_diff>